<commit_message>
Update diploma documentation for guided setup and pairing
</commit_message>
<xml_diff>
--- a/artifacts/diploma/Дипломный проект UFI Phone Куватов Руслан Бахтиярович.docx
+++ b/artifacts/diploma/Дипломный проект UFI Phone Куватов Руслан Бахтиярович.docx
@@ -4281,7 +4281,7 @@
         </w:rPr>
         <w:t>2.2 Компонентная архитектура</w:t>
         <w:tab/>
-        <w:t>23</w:t>
+        <w:t>24</w:t>
       </w:r>
     </w:p>
     <w:p>
@@ -4357,7 +4357,7 @@
         </w:rPr>
         <w:t>2.6 Проектирование SMS и пользовательских клиентов</w:t>
         <w:tab/>
-        <w:t>32</w:t>
+        <w:t>33</w:t>
       </w:r>
     </w:p>
     <w:p>
@@ -4376,7 +4376,7 @@
         </w:rPr>
         <w:t>2.7 Безопасность, приватность и надёжность</w:t>
         <w:tab/>
-        <w:t>34</w:t>
+        <w:t>35</w:t>
       </w:r>
     </w:p>
     <w:p>
@@ -4395,7 +4395,7 @@
         </w:rPr>
         <w:t>ГЛАВА III. РЕАЛИЗАЦИЯ И ТЕСТИРОВАНИЕ</w:t>
         <w:tab/>
-        <w:t>36</w:t>
+        <w:t>38</w:t>
       </w:r>
     </w:p>
     <w:p>
@@ -4414,7 +4414,7 @@
         </w:rPr>
         <w:t>3.1 Реализация doctor, профилей и безопасной установки</w:t>
         <w:tab/>
-        <w:t>36</w:t>
+        <w:t>38</w:t>
       </w:r>
     </w:p>
     <w:p>
@@ -4433,7 +4433,7 @@
         </w:rPr>
         <w:t>3.2 Реализация gateway и network guard</w:t>
         <w:tab/>
-        <w:t>37</w:t>
+        <w:t>39</w:t>
       </w:r>
     </w:p>
     <w:p>
@@ -4452,7 +4452,7 @@
         </w:rPr>
         <w:t>3.3 Реализация вызовов и двустороннего звука</w:t>
         <w:tab/>
-        <w:t>38</w:t>
+        <w:t>40</w:t>
       </w:r>
     </w:p>
     <w:p>
@@ -4471,7 +4471,7 @@
         </w:rPr>
         <w:t>3.4 Реализация SMS и клиентских интерфейсов</w:t>
         <w:tab/>
-        <w:t>39</w:t>
+        <w:t>41</w:t>
       </w:r>
     </w:p>
     <w:p>
@@ -4490,7 +4490,7 @@
         </w:rPr>
         <w:t>3.5 Desktop, упаковка и поставка</w:t>
         <w:tab/>
-        <w:t>40</w:t>
+        <w:t>43</w:t>
       </w:r>
     </w:p>
     <w:p>
@@ -4509,7 +4509,7 @@
         </w:rPr>
         <w:t>3.6 Тестирование и результаты</w:t>
         <w:tab/>
-        <w:t>42</w:t>
+        <w:t>44</w:t>
       </w:r>
     </w:p>
     <w:p>
@@ -4528,7 +4528,7 @@
         </w:rPr>
         <w:t>3.7 Ограничения, приёмка и развитие</w:t>
         <w:tab/>
-        <w:t>44</w:t>
+        <w:t>47</w:t>
       </w:r>
     </w:p>
     <w:p>
@@ -4547,7 +4547,7 @@
         </w:rPr>
         <w:t>ГЛАВА IV. БЕЗОПАСНОСТЬ ЖИЗНЕДЕЯТЕЛЬНОСТИ</w:t>
         <w:tab/>
-        <w:t>47</w:t>
+        <w:t>49</w:t>
       </w:r>
     </w:p>
     <w:p>
@@ -4566,7 +4566,7 @@
         </w:rPr>
         <w:t>4.1 Анализ условий труда и рисков</w:t>
         <w:tab/>
-        <w:t>47</w:t>
+        <w:t>49</w:t>
       </w:r>
     </w:p>
     <w:p>
@@ -4585,7 +4585,7 @@
         </w:rPr>
         <w:t>4.2 Эргономика и расчёт освещения</w:t>
         <w:tab/>
-        <w:t>48</w:t>
+        <w:t>50</w:t>
       </w:r>
     </w:p>
     <w:p>
@@ -4604,7 +4604,7 @@
         </w:rPr>
         <w:t>4.3 Электрическая, тепловая и пожарная безопасность</w:t>
         <w:tab/>
-        <w:t>50</w:t>
+        <w:t>52</w:t>
       </w:r>
     </w:p>
     <w:p>
@@ -4623,7 +4623,7 @@
         </w:rPr>
         <w:t>4.4 Радиочастотная и информационная безопасность</w:t>
         <w:tab/>
-        <w:t>51</w:t>
+        <w:t>53</w:t>
       </w:r>
     </w:p>
     <w:p>
@@ -4642,7 +4642,7 @@
         </w:rPr>
         <w:t>ЗАКЛЮЧЕНИЕ</w:t>
         <w:tab/>
-        <w:t>53</w:t>
+        <w:t>55</w:t>
       </w:r>
     </w:p>
     <w:p>
@@ -4661,7 +4661,7 @@
         </w:rPr>
         <w:t>СПИСОК ИСПОЛЬЗОВАННЫХ ИСТОЧНИКОВ</w:t>
         <w:tab/>
-        <w:t>55</w:t>
+        <w:t>57</w:t>
       </w:r>
     </w:p>
     <w:p>
@@ -4745,6 +4745,7 @@
     <w:p>
       <w:pPr>
         <w:pStyle w:val="Heading1"/>
+        <w:pageBreakBefore w:val="0"/>
       </w:pPr>
       <w:r>
         <w:rPr>
@@ -4916,7 +4917,7 @@
           <w:rFonts w:ascii="Times New Roman" w:hAnsi="Times New Roman" w:eastAsia="Times New Roman"/>
           <w:sz w:val="28"/>
         </w:rPr>
-        <w:t>разработать механизм точной идентификации аппаратного профиля и отказа от опасной установки;</w:t>
+        <w:t>разработать механизм точной идентификации аппаратного профиля, guided setup и отказа от опасной установки;</w:t>
       </w:r>
     </w:p>
     <w:p>
@@ -4946,7 +4947,7 @@
           <w:rFonts w:ascii="Times New Roman" w:hAnsi="Times New Roman" w:eastAsia="Times New Roman"/>
           <w:sz w:val="28"/>
         </w:rPr>
-        <w:t>обеспечить локальную аутентификацию, ограничение сетевой области и безопасное хранение pairing token;</w:t>
+        <w:t>обеспечить локальную аутентификацию, ограничение сетевой области, первичное ADB-pairing и защищённый перенос конфигурации между компьютерами;</w:t>
       </w:r>
     </w:p>
     <w:p>
@@ -5021,7 +5022,7 @@
           <w:rFonts w:ascii="Times New Roman" w:hAnsi="Times New Roman" w:eastAsia="Times New Roman"/>
           <w:sz w:val="28"/>
         </w:rPr>
-        <w:t>Практическая значимость состоит в получении работающего комплекса версии 0.5.0. Он поддерживает входящие и исходящие вызовы, Answer и Hang up, двусторонний звук, историю последних вызовов, локальные SMS-диалоги, уведомления, автоматический запуск и восстановление радиорежима. Основные данные не требуют developer-operated сервера, аналитики или облачного relay. Реализация опубликована как единый репозиторий с Android-компонентами, desktop-клиентом, установщиком, документацией поставки и материалами Google Play.</w:t>
+        <w:t>Практическая значимость состоит в получении работающего комплекса версии 0.5.0. Он поддерживает входящие и исходящие вызовы, Answer и Hang up, двусторонний звук, историю последних вызовов, локальные SMS-диалоги, уведомления, автоматический запуск и восстановление радиорежима. Основные данные не требуют developer-operated сервера, аналитики или облачного relay. Guided setup запускается одной командой, автоматически выбирает проверенный модем и один совместимый планшет, а новый desktop-клиент открывает экран Connection и принимает приватный файл .ufi-phone для дополнительного компьютера. Реализация опубликована как единый репозиторий с Android-компонентами, desktop-клиентом, установщиком, документацией поставки и материалами Google Play.</w:t>
       </w:r>
     </w:p>
     <w:p>
@@ -5062,6 +5063,7 @@
     <w:p>
       <w:pPr>
         <w:pStyle w:val="Heading1"/>
+        <w:pageBreakBefore w:val="0"/>
       </w:pPr>
       <w:r>
         <w:rPr>
@@ -5170,7 +5172,7 @@
           <w:rFonts w:ascii="Times New Roman" w:hAnsi="Times New Roman" w:eastAsia="Times New Roman"/>
           <w:sz w:val="28"/>
         </w:rPr>
-        <w:t>На рисунке 1.1 показан контекст комплекса. UFI003 владеет SIM-картой и соединением с оператором. Android, Linux и Windows обращаются к нему по локальной сети. ADB нужен для первоначальной установки и безопасной передачи конфигурации, но не участвует в обычном вызове или чтении SMS.</w:t>
+        <w:t>На рисунке 1.1 показан контекст комплекса. UFI003 владеет SIM-картой и соединением с оператором. Android, Linux и Windows обращаются к нему по локальной сети. ADB нужен для первоначальной установки и первичного pairing. Дополнительный desktop можно подключить явным переносом приватного файла .ufi-phone; ни ADB, ни этот файл не участвуют в обычном вызове или чтении SMS.</w:t>
       </w:r>
     </w:p>
     <w:p>
@@ -8485,7 +8487,7 @@
                 <w:rFonts w:ascii="Times New Roman" w:hAnsi="Times New Roman" w:eastAsia="Times New Roman"/>
                 <w:sz w:val="21"/>
               </w:rPr>
-              <w:t>Неизвестный профиль отвергается до привилегированной установки</w:t>
+              <w:t>Guided setup показывает план; exact-match обязателен, а dry-run ничего не изменяет</w:t>
             </w:r>
           </w:p>
         </w:tc>
@@ -9378,6 +9380,7 @@
     <w:p>
       <w:pPr>
         <w:pStyle w:val="Heading1"/>
+        <w:pageBreakBefore w:val="0"/>
       </w:pPr>
       <w:r>
         <w:rPr>
@@ -9486,7 +9489,22 @@
           <w:rFonts w:ascii="Times New Roman" w:hAnsi="Times New Roman" w:eastAsia="Times New Roman"/>
           <w:sz w:val="28"/>
         </w:rPr>
-        <w:t>Сценарий установки отделён от эксплуатации. Установщик запускает ufi_setup.py doctor, проверяет отчёт и только затем выполняет install. Установщик имеет право менять системную часть; обычный клиент такого права не получает. Pairing token передаётся через ADB receiver, защищённый signature-разрешением DUMP, и не вводится через LAN API.</w:t>
+        <w:t>Сценарий установки отделён от эксплуатации. Установщик подключает модем и, при необходимости, планшет по USB, затем запускает ./setup.sh. Guided setup вызывает read-only doctor, автоматически выбирает один модем с точным tested-профилем и не более одного планшета Android 8+, показывает полный план, собирает и устанавливает компоненты, выполняет pairing и проверяет private-LAN gateway. Неоднозначный выбор и неподтверждённый модем приводят к отказу до изменения устройств. Режимы --dry-run и --desktop-only позволяют отдельно проверить план или установить только desktop-сценарий.</w:t>
+      </w:r>
+    </w:p>
+    <w:p>
+      <w:pPr>
+        <w:widowControl/>
+        <w:spacing w:line="360" w:lineRule="auto" w:before="0" w:after="0"/>
+        <w:ind w:firstLine="709"/>
+        <w:jc w:val="both"/>
+      </w:pPr>
+      <w:r>
+        <w:rPr>
+          <w:rFonts w:ascii="Times New Roman" w:hAnsi="Times New Roman" w:eastAsia="Times New Roman"/>
+          <w:sz w:val="28"/>
+        </w:rPr>
+        <w:t>Первичный pairing token передаётся через ADB receiver, защищённый signature-разрешением DUMP, и не вводится через LAN API. Для второго Linux- или Windows-компьютера установщик может явно экспортировать .ufi-phone, перенести его доверенным способом, импортировать на экране Connection и удалить переданную копию. Обычный клиент не получает права изменять системную часть модема.</w:t>
       </w:r>
     </w:p>
     <w:p>
@@ -10121,14 +10139,14 @@
             <w:pPr>
               <w:spacing w:line="240" w:lineRule="auto" w:after="0"/>
               <w:ind w:firstLine="0"/>
-              <w:jc w:val="center"/>
+              <w:jc w:val="left"/>
             </w:pPr>
             <w:r>
               <w:rPr>
                 <w:rFonts w:ascii="Times New Roman" w:hAnsi="Times New Roman" w:eastAsia="Times New Roman"/>
                 <w:sz w:val="21"/>
               </w:rPr>
-              <w:t>ufi_setup.py</w:t>
+              <w:t>setup.sh / ufi_setup.py</w:t>
             </w:r>
           </w:p>
         </w:tc>
@@ -10154,7 +10172,7 @@
                 <w:rFonts w:ascii="Times New Roman" w:hAnsi="Times New Roman" w:eastAsia="Times New Roman"/>
                 <w:sz w:val="21"/>
               </w:rPr>
-              <w:t>Linux/Windows с ADB</w:t>
+              <w:t>Linux с ADB</w:t>
             </w:r>
           </w:p>
         </w:tc>
@@ -10180,7 +10198,7 @@
                 <w:rFonts w:ascii="Times New Roman" w:hAnsi="Times New Roman" w:eastAsia="Times New Roman"/>
                 <w:sz w:val="21"/>
               </w:rPr>
-              <w:t>Doctor, exact-match профиль, сборка и парное развёртывание</w:t>
+              <w:t>Автовыбор exact-match, план, сборка, установка, pairing и проверка</w:t>
             </w:r>
           </w:p>
         </w:tc>
@@ -10458,7 +10476,7 @@
           <w:rFonts w:ascii="Times New Roman" w:hAnsi="Times New Roman" w:eastAsia="Times New Roman"/>
           <w:sz w:val="28"/>
         </w:rPr>
-        <w:t>Таблица 2.1 показывает, что ufi_setup.py, ufi_voice.py и ufi_sms.py тоже являются частями архитектуры. Первый обеспечивает безопасный жизненный цикл установки, второй — настройку и диагностический интерфейс голосового gateway, третий — резервный SMS-доступ через USB. Их сохранение уменьшает зависимость от одного UI и позволяет проверять слой по отдельности.</w:t>
+        <w:t>Таблица 2.1 показывает, что setup.sh, ufi_setup.py, ufi_voice.py и ufi_sms.py тоже являются частями архитектуры. Первые два образуют guided setup: внешний скрипт задаёт рекомендуемую точку входа, а Python-модуль выполняет doctor, автовыбор, планирование, установку и экспорт pairing. ufi_voice.py предоставляет настройку и диагностический интерфейс gateway, а ufi_sms.py — резервный SMS-доступ через USB. Их сохранение уменьшает зависимость от одного UI и позволяет проверять каждый слой отдельно.</w:t>
       </w:r>
     </w:p>
     <w:p>
@@ -10601,7 +10619,37 @@
           <w:rFonts w:ascii="Times New Roman" w:hAnsi="Times New Roman" w:eastAsia="Times New Roman"/>
           <w:sz w:val="28"/>
         </w:rPr>
-        <w:t>После exact match сборщик создаёт три Android-компонента: Network Guard, Voice Gateway и UFI Phone. Системные APK подписываются только после проверки fingerprint ожидаемого сертификата. Далее ufi_voice.py setup создаёт случайный token длиной 256 бит, сохраняет его в пользовательском конфигурационном каталоге с приватными правами и передаёт gateway через ADB. Setup tablet аналогично передаёт host/token, выдаёт runtime-разрешения микрофона и уведомлений и исключает foreground monitor из idle mode.</w:t>
+        <w:t>Рекомендуемая точка входа ./setup.sh вызывает команду ufi_setup.py setup. Алгоритм выбирает ровно один tested modem profile; при нескольких подходящих модемах требует --modem-serial. Для планшета применяется тот же принцип: автоматически допускается один Android 8+ client, а неоднозначность устраняется только явным --tablet-serial либо режимом --desktop-only. До выполнения операций выводится план. --dry-run завершает процесс без изменения файлов и устройств, а --skip-build не отменяет повторный hardware match.</w:t>
+      </w:r>
+    </w:p>
+    <w:p>
+      <w:pPr>
+        <w:widowControl/>
+        <w:spacing w:line="360" w:lineRule="auto" w:before="0" w:after="0"/>
+        <w:ind w:firstLine="709"/>
+        <w:jc w:val="both"/>
+      </w:pPr>
+      <w:r>
+        <w:rPr>
+          <w:rFonts w:ascii="Times New Roman" w:hAnsi="Times New Roman" w:eastAsia="Times New Roman"/>
+          <w:sz w:val="28"/>
+        </w:rPr>
+        <w:t>После exact match сборщик создаёт три Android-компонента: Network Guard, Voice Gateway и UFI Phone. Системные APK подписываются только после проверки fingerprint ожидаемого сертификата. Далее ufi_voice.py setup создаёт случайный token длиной 256 бит, сохраняет его в пользовательском конфигурационном каталоге с приватными правами и передаёт gateway через ADB. Setup tablet аналогично передаёт host/token, выдаёт runtime-разрешения микрофона и уведомлений и исключает foreground monitor из idle mode. Guided setup завершает процесс проверкой private-LAN gateway и явно сообщает, что Telegram остаётся выключенным.</w:t>
+      </w:r>
+    </w:p>
+    <w:p>
+      <w:pPr>
+        <w:widowControl/>
+        <w:spacing w:line="360" w:lineRule="auto" w:before="0" w:after="0"/>
+        <w:ind w:firstLine="709"/>
+        <w:jc w:val="both"/>
+      </w:pPr>
+      <w:r>
+        <w:rPr>
+          <w:rFonts w:ascii="Times New Roman" w:hAnsi="Times New Roman" w:eastAsia="Times New Roman"/>
+          <w:sz w:val="28"/>
+        </w:rPr>
+        <w:t>Переносимый pairing document имеет kind=ufi-phone-pairing, версию 1, host и token. Экспорт не перезаписывает существующий файл без --force и на POSIX создаёт его с правами 0600. Это не новый сетевой канал настройки: файл лишь переносит уже созданную конфигурацию на другой компьютер и требует защищённой передачи и удаления копии после импорта.</w:t>
       </w:r>
     </w:p>
     <w:p>
@@ -11434,7 +11482,7 @@
           <w:rFonts w:ascii="Times New Roman" w:hAnsi="Times New Roman" w:eastAsia="Times New Roman"/>
           <w:sz w:val="28"/>
         </w:rPr>
-        <w:t>Рисунок 2.3 объединяет сетевую и криптографическую границы. Private LAN уменьшает круг возможных источников, HMAC подтверждает знание token, а ADB-only configuration предотвращает удалённую замену секрета. Ни один отдельный механизм не объявляется достаточным сам по себе.</w:t>
+        <w:t>Рисунок 2.3 объединяет сетевую и криптографическую границы. Private LAN уменьшает круг возможных источников, HMAC подтверждает знание token, а первичная ADB-конфигурация предотвращает удалённую замену секрета. Явный экспорт .ufi-phone не открывает конфигурационный LAN API, но требует дисциплины обращения с файлом. Ни один отдельный механизм не объявляется достаточным сам по себе.</w:t>
       </w:r>
     </w:p>
     <w:p>
@@ -11776,7 +11824,7 @@
           <w:rFonts w:ascii="Times New Roman" w:hAnsi="Times New Roman" w:eastAsia="Times New Roman"/>
           <w:sz w:val="28"/>
         </w:rPr>
-        <w:t>Android UI следует знакомой модели: Calls отображает readiness и историю, Keypad имеет одно основное действие, Messages показывает список диалогов и область переписки. VoiceMonitorService создаёт постоянное тихое уведомление при нормальной работе, а сбой token, disconnect или небезопасный radio mode показывается как actionable state. Входящий вызов использует полноэкранный alert только по назначению, что учитывается в декларациях Google Play.</w:t>
+        <w:t>Android UI следует знакомой модели: Calls отображает readiness и историю, Keypad имеет одно основное действие, Messages показывает список диалогов и область переписки. Если pairing отсутствует или модем недоступен, Calls показывает карточку Finish setup либо Modem offline с конкретным действием; состояние восстановления сети обозначается как Repairing calls. VoiceMonitorService создаёт постоянное тихое уведомление при нормальной работе. Входящий вызов использует полноэкранный alert только по назначению, что учитывается в декларациях Google Play.</w:t>
       </w:r>
     </w:p>
     <w:p>
@@ -11791,7 +11839,7 @@
           <w:rFonts w:ascii="Times New Roman" w:hAnsi="Times New Roman" w:eastAsia="Times New Roman"/>
           <w:sz w:val="28"/>
         </w:rPr>
-        <w:t>Desktop UI повторяет информационную архитектуру, но использует ширину окна для боковой навигации и таблиц. История и pairing config сохраняются локально и не встраиваются в executable. Такой подход позволяет собирать portable binary, не раскрывая данные разработчика или тестового абонента.</w:t>
+        <w:t>Desktop UI повторяет информационную архитектуру, но использует ширину окна для боковой навигации и таблиц. Чистая установка больше не завершается ошибкой из-за отсутствия config: приложение открывает guided Connection screen с инструкцией запуска ./setup.sh, импортом .ufi-phone, повтором соединения и экспортом текущего pairing. Подробности восстановления радиорежима находятся в Connection, а здоровый статус остаётся спокойным и коротким. История и pairing config сохраняются локально и не встраиваются в executable.</w:t>
       </w:r>
     </w:p>
     <w:p>
@@ -11804,8 +11852,8 @@
       <w:r>
         <w:drawing>
           <wp:inline xmlns:a="http://schemas.openxmlformats.org/drawingml/2006/main" xmlns:pic="http://schemas.openxmlformats.org/drawingml/2006/picture">
-            <wp:extent cx="5623560" cy="3499104"/>
-            <wp:docPr id="9" name="Picture 9" title="Рисунок 2.7" descr="Интерфейсы вызовов и сообщений UFI Phone"/>
+            <wp:extent cx="5623560" cy="4530090"/>
+            <wp:docPr id="9" name="Picture 9" title="Рисунок 2.7" descr="Интерфейсы вызовов, сообщений и подключения UFI Phone"/>
             <wp:cNvGraphicFramePr>
               <a:graphicFrameLocks noChangeAspect="1"/>
             </wp:cNvGraphicFramePr>
@@ -11825,7 +11873,7 @@
                   <pic:spPr>
                     <a:xfrm>
                       <a:off x="0" y="0"/>
-                      <a:ext cx="5623560" cy="3499104"/>
+                      <a:ext cx="5623560" cy="4530090"/>
                     </a:xfrm>
                     <a:prstGeom prst="rect"/>
                   </pic:spPr>
@@ -11847,7 +11895,7 @@
           <w:b w:val="0"/>
           <w:sz w:val="24"/>
         </w:rPr>
-        <w:t>Рисунок 2.7. Интерфейсы вызовов и сообщений UFI Phone</w:t>
+        <w:t>Рисунок 2.7. Интерфейсы вызовов, сообщений и подключения UFI Phone</w:t>
       </w:r>
     </w:p>
     <w:p>
@@ -11862,7 +11910,7 @@
           <w:rFonts w:ascii="Times New Roman" w:hAnsi="Times New Roman" w:eastAsia="Times New Roman"/>
           <w:sz w:val="28"/>
         </w:rPr>
-        <w:t>Скриншоты на рисунке 2.7 выполнены на демонстрационных данных. Они показывают ключевое UX-решение: рядом со звонками видна готовность «Modem · Ucell · Ready», а Messages работает как диалог, а не как список PDU. Примерные имена не являются реальными телефонными номерами и безопасны для презентации.</w:t>
+        <w:t>Скриншоты на рисунке 2.7 выполнены на демонстрационных данных. Они показывают три основных состояния desktop-клиента: Calls с краткой готовностью сети, Messages в виде диалога вместо списка PDU и Connection с пошаговой настройкой и импортом .ufi-phone. Примерные имена не являются реальными телефонными номерами и безопасны для презентации.</w:t>
       </w:r>
     </w:p>
     <w:p>
@@ -11889,7 +11937,7 @@
           <w:rFonts w:ascii="Times New Roman" w:hAnsi="Times New Roman" w:eastAsia="Times New Roman"/>
           <w:sz w:val="28"/>
         </w:rPr>
-        <w:t>Модель угроз охватывает локального нарушителя в Wi‑Fi сети модема, утечку configuration file, replay команды, ошибочную установку, несанкционированный аудиоклиент и включение внешнего SMS-forwarding. Физически скомпрометированное устройство с root-доступом находится вне границы: такой нарушитель может прочитать token и системные данные. Задача проекта — не заменить аппаратный secure element, а минимизировать удалённую поверхность и опасные defaults.</w:t>
+        <w:t>Модель угроз охватывает локального нарушителя в Wi‑Fi сети модема, утечку configuration или .ufi-phone, подмену формата pairing, replay команды, ошибочную установку, несанкционированный аудиоклиент и включение внешнего SMS-forwarding. Физически скомпрометированное устройство с root-доступом находится вне границы: такой нарушитель может прочитать token и системные данные. Задача проекта — не заменить аппаратный secure element, а минимизировать удалённую поверхность и опасные defaults.</w:t>
       </w:r>
     </w:p>
     <w:p>
@@ -12204,7 +12252,7 @@
                 <w:rFonts w:ascii="Times New Roman" w:hAnsi="Times New Roman" w:eastAsia="Times New Roman"/>
                 <w:sz w:val="21"/>
               </w:rPr>
-              <w:t>Утечка pairing token</w:t>
+              <w:t>Утечка pairing token или .ufi-phone</w:t>
             </w:r>
           </w:p>
         </w:tc>
@@ -12230,7 +12278,7 @@
                 <w:rFonts w:ascii="Times New Roman" w:hAnsi="Times New Roman" w:eastAsia="Times New Roman"/>
                 <w:sz w:val="21"/>
               </w:rPr>
-              <w:t>Доступ внутри LAN</w:t>
+              <w:t>Доступ к шлюзу внутри LAN</w:t>
             </w:r>
           </w:p>
         </w:tc>
@@ -12256,7 +12304,7 @@
                 <w:rFonts w:ascii="Times New Roman" w:hAnsi="Times New Roman" w:eastAsia="Times New Roman"/>
                 <w:sz w:val="21"/>
               </w:rPr>
-              <w:t>Генерация 256 бит, права пользователя, передача только через ADB</w:t>
+              <w:t>Первичная передача через ADB; явный экспорт 0600, проверка формата, приватный перенос и удаление</w:t>
             </w:r>
           </w:p>
         </w:tc>
@@ -12617,7 +12665,7 @@
           <w:rFonts w:ascii="Times New Roman" w:hAnsi="Times New Roman" w:eastAsia="Times New Roman"/>
           <w:sz w:val="28"/>
         </w:rPr>
-        <w:t>Pairing token генерируется криптографически случайным, не помещается в исходный код, APK или shell history. На desktop он хранится в ~/.config/ufi-voice-gateway/client.json с правами пользователя. Android получает его через ADB receiver с permission DUMP. В логах нельзя печатать token, SMS, номер абонента или аудиосодержимое.</w:t>
+        <w:t>Pairing token генерируется криптографически случайным, не помещается в исходный код, APK или shell history. На desktop он хранится в ~/.config/ufi-voice-gateway/client.json с правами пользователя. Android получает его через ADB receiver с permission DUMP. Импорт .ufi-phone ограничен размером 16 КиБ, требует точного kind/version и повторно проверяет host/token через общий validate_config. Файл содержит access key в открытом виде, поэтому его передают приватно, удаляют после импорта и при раскрытии немедленно заменяют token. В логах нельзя печатать token, SMS, номер абонента или аудиосодержимое.</w:t>
       </w:r>
     </w:p>
     <w:p>
@@ -12692,7 +12740,7 @@
           <w:rFonts w:ascii="Times New Roman" w:hAnsi="Times New Roman" w:eastAsia="Times New Roman"/>
           <w:sz w:val="28"/>
         </w:rPr>
-        <w:t>Вывод по второй главе: комплекс разделён на четыре слоя. Exact-match ограничивает установку, challenge-response защищает сессии, state model согласует UI с телефонией, а один аудиоклиент исключает смешение потоков. Расширение выполняется через измеренные профили.</w:t>
+        <w:t>Вывод по второй главе: комплекс разделён на четыре слоя. Exact-match и guided setup ограничивают установку, challenge-response защищает сессии, state model согласует UI с телефонией, а один аудиоклиент исключает смешение потоков. Перенос pairing между компьютерами выполняется отдельным проверяемым документом, не ослабляя сетевую аутентификацию. Расширение выполняется через измеренные профили.</w:t>
       </w:r>
     </w:p>
     <w:p>
@@ -12703,6 +12751,7 @@
     <w:p>
       <w:pPr>
         <w:pStyle w:val="Heading1"/>
+        <w:pageBreakBefore w:val="0"/>
       </w:pPr>
       <w:r>
         <w:rPr>
@@ -12736,7 +12785,7 @@
           <w:rFonts w:ascii="Times New Roman" w:hAnsi="Times New Roman" w:eastAsia="Times New Roman"/>
           <w:sz w:val="28"/>
         </w:rPr>
-        <w:t>Установщик реализован на Python в ufi_setup.py. Выбор Python обусловлен наличием стандартных средств запуска процессов, JSON, регулярных выражений и работы с файловой системой. Скрипт имеет команды doctor, profiles, build и install. Разделение команд позволяет сначала получить read-only evidence и не совмещать диагностику с изменением устройства.</w:t>
+        <w:t>Установщик реализован на Python в ufi_setup.py, а setup.sh служит короткой рекомендуемой точкой входа. Выбор Python обусловлен наличием стандартных средств запуска процессов, JSON, регулярных выражений и работы с файловой системой. Скрипт имеет команды doctor, profiles, build, setup, совместимую команду install и pairing. Разделение команд позволяет сначала получить read-only evidence, затем показать план и только после этого изменить проверенные устройства.</w:t>
       </w:r>
     </w:p>
     <w:p>
@@ -12796,7 +12845,7 @@
           <w:rFonts w:ascii="Times New Roman" w:hAnsi="Times New Roman" w:eastAsia="Times New Roman"/>
           <w:sz w:val="28"/>
         </w:rPr>
-        <w:t>Команда install повторно вызывает полный отчёт по указанному modem serial. Даже если пользователь до этого вручную посмотрел doctor, privileged path не доверяет старому результату. При status, отличном от tested, выбрасывается SetupError с рекомендацией создать проверенный профиль. После успеха выполняется сборка Network Guard, Voice Gateway и tablet client, затем modem setup и optional tablet pairing.</w:t>
+        <w:t>Команда setup повторно вызывает полный отчёт и передаёт его в select_install_targets. Даже если пользователь до этого вручную посмотрел doctor, privileged path не доверяет старому результату. Автовыбор требует один tested modem и не более одного подходящего планшета; unverified hardware, несколько кандидатов или слишком старая версия Android приводят к SetupError. После подтверждённого выбора выполняются сборка Network Guard, Voice Gateway и tablet client, modem setup, optional tablet pairing и проверка шлюза.</w:t>
       </w:r>
     </w:p>
     <w:p>
@@ -12811,7 +12860,7 @@
           <w:rFonts w:ascii="Times New Roman" w:hAnsi="Times New Roman" w:eastAsia="Times New Roman"/>
           <w:sz w:val="28"/>
         </w:rPr>
-        <w:t>Скрипт завершает установку сообщением о том, что cloud/Telegram не включены. Это важный secure default: наличие legacy-компонента в репозитории не означает автоматическую передачу данных. Опция --skip-build оставлена для воспроизводимых случаев, когда APK уже собраны, но не отменяет hardware match.</w:t>
+        <w:t>Скрипт завершает установку сообщением о том, что cloud/Telegram не включены. Это важный secure default: наличие legacy-компонента в репозитории не означает автоматическую передачу данных. Опция --skip-build оставлена для воспроизводимых случаев, когда APK уже собраны, но не отменяет hardware match. Команда pairing и флаг --pairing-file используют атомарную запись через временный файл, не показывают token в stdout и запрещают случайную перезапись без --force.</w:t>
       </w:r>
     </w:p>
     <w:p>
@@ -13072,7 +13121,7 @@
           <w:rFonts w:ascii="Times New Roman" w:hAnsi="Times New Roman" w:eastAsia="Times New Roman"/>
           <w:sz w:val="28"/>
         </w:rPr>
-        <w:t>MainActivity реализует три раздела. Calls показывает network readiness, текущий вызов и историю. Keypad предоставляет цифровой набор и backspace; blocked number объясняется пользователю как ограничение безопасности. Messages показывает conversation list, detail pane и New message. В landscape ширина используется для двух колонок, а не для растяжения одного телефонного экрана.</w:t>
+        <w:t>MainActivity реализует три раздела. Calls показывает network readiness, текущий вызов и историю, а при состояниях NOT_PAIRED, OFFLINE или unsafe call mode добавляет понятную карточку восстановления. Finish setup прямо указывает подключить планшет по USB и выполнить ./setup.sh. Keypad предоставляет цифровой набор и backspace; blocked number объясняется пользователю как ограничение безопасности. Messages показывает conversation list, detail pane и New message. В landscape ширина используется для двух колонок, а не для растяжения одного телефонного экрана.</w:t>
       </w:r>
     </w:p>
     <w:p>
@@ -13159,7 +13208,7 @@
           <w:rFonts w:ascii="Times New Roman" w:hAnsi="Times New Roman" w:eastAsia="Times New Roman"/>
           <w:sz w:val="28"/>
         </w:rPr>
-        <w:t>Desktop-приложение написано на Python и отделяет model от Tk-based UI. Модель нормализует номера, группирует SMS, вычисляет unread и формирует call history. Разделение позволило тестировать предметные функции без графического окружения. Конфигурация и история находятся в пользовательских каталогах и не включаются в бинарник.</w:t>
+        <w:t>Desktop-приложение написано на Python и отделяет model от Tk-based UI. Модель нормализует номера, группирует SMS, вычисляет unread, формирует call history и проверяет импорт pairing document. Разделение позволило тестировать предметные функции без графического окружения. Первый запуск показывает Connection вместо аварийного выхода, а функции import/export используют тот же валидатор конфигурации, что и CLI. Конфигурация и история находятся в пользовательских каталогах и не включаются в бинарник.</w:t>
       </w:r>
     </w:p>
     <w:p>
@@ -13174,7 +13223,7 @@
           <w:rFonts w:ascii="Times New Roman" w:hAnsi="Times New Roman" w:eastAsia="Times New Roman"/>
           <w:sz w:val="28"/>
         </w:rPr>
-        <w:t>Для Windows используется PyInstaller specification и Inno Setup installer. Portable executable предназначен для запуска без Python; installer создаёт привычные ярлыки и uninstall. Для Linux подготовлены AppRun, .desktop, AppStream metadata, portable/interactive package и Debian structure. Install/uninstall scripts проверяют пути и не требуют копировать pairing token в system-wide location.</w:t>
+        <w:t>Для Windows используется PyInstaller specification и Inno Setup installer. Portable executable предназначен для запуска без Python; installer создаёт ярлыки, uninstall и ассоциацию .ufi-phone. Для Linux подготовлены AppRun, .desktop, MIME metadata, portable/interactive package и Debian structure. Установленные Linux и Windows пакеты могут открыть pairing file двойным щелчком; сам token по-прежнему сохраняется только в пользовательской конфигурации, а не в system-wide location.</w:t>
       </w:r>
     </w:p>
     <w:p>
@@ -13189,7 +13238,7 @@
           <w:rFonts w:ascii="Times New Roman" w:hAnsi="Times New Roman" w:eastAsia="Times New Roman"/>
           <w:sz w:val="28"/>
         </w:rPr>
-        <w:t>Android companion имеет Gradle 9.6/Android Gradle Plugin 9.4.1, target API 36 и может формировать AAB. Signing credentials передаются переменными окружения UFI_ANDROID_*. Если они отсутствуют, workflow создаёт unsigned review artifact и не имитирует production signing. Modem APK по-прежнему собираются отдельными скриптами для API 19.</w:t>
+        <w:t>Android companion имеет Gradle 9.7.1/Android Gradle Plugin 9.4.1, target API 36 и может формировать AAB. URL дистрибутива wrapper дополнен фиксированным SHA-256, а CI проверяет wrapper binaries до сборки. Signing credentials передаются переменными окружения UFI_ANDROID_*. Если они отсутствуют, workflow создаёт unsigned review artifact и не имитирует production signing. Modem APK по-прежнему собираются отдельными скриптами для API 19.</w:t>
       </w:r>
     </w:p>
     <w:p>
@@ -13275,7 +13324,7 @@
           <w:rFonts w:ascii="Times New Roman" w:hAnsi="Times New Roman" w:eastAsia="Times New Roman"/>
           <w:sz w:val="28"/>
         </w:rPr>
-        <w:t>GitHub Actions собирает Android AAB, Linux/Windows desktop executables и Linux packages. External actions закреплены на commit SHA, а project guard запрещает неприкреплённые references. Tagged version должна совпадать с version metadata во всех пакетах. На момент проверки согласована версия 0.5.0.</w:t>
+        <w:t>GitHub Actions собирает Android AAB, Linux/Windows desktop executables и Linux packages. Test и Android jobs закреплены за ubuntu-24.04, external actions — за commit SHA, а project guard запрещает неприкреплённые references. Tagged version должна совпадать с version metadata во всех пакетах. На момент проверки согласована версия 0.5.0.</w:t>
       </w:r>
     </w:p>
     <w:p>
@@ -13332,7 +13381,7 @@
           <w:rFonts w:ascii="Times New Roman" w:hAnsi="Times New Roman" w:eastAsia="Times New Roman"/>
           <w:sz w:val="28"/>
         </w:rPr>
-        <w:t>Тестовый прогон выполнен 25 сентября 2026 года командой uv run --with pyusb==1.3.1 python -m unittest discover -s tests -p 'test_*.py' -v. Использование изолированной зависимости важно: первоначальный запуск без PyUSB завершился ImportError среды, а не дефектом проекта. После подключения заявленной зависимости все тесты выполнились успешно.</w:t>
+        <w:t>Тестовый прогон выполнен 27 сентября 2026 года командой uv run --with pyusb==1.3.1 python -m unittest discover -s tests -p 'test_*.py' -v. Использование изолированной зависимости фиксирует версию PyUSB и делает результат воспроизводимым. Все тесты выполнились успешно.</w:t>
       </w:r>
     </w:p>
     <w:p>
@@ -13447,7 +13496,7 @@
                 <w:b/>
                 <w:sz w:val="21"/>
               </w:rPr>
-              <w:t>Результат 25.09.2026</w:t>
+              <w:t>Результат 27.09.2026</w:t>
             </w:r>
           </w:p>
         </w:tc>
@@ -13530,7 +13579,7 @@
                 <w:rFonts w:ascii="Times New Roman" w:hAnsi="Times New Roman" w:eastAsia="Times New Roman"/>
                 <w:sz w:val="21"/>
               </w:rPr>
-              <w:t>Пройдено</w:t>
+              <w:t>1 тест пройден</w:t>
             </w:r>
           </w:p>
         </w:tc>
@@ -13589,7 +13638,176 @@
                 <w:rFonts w:ascii="Times New Roman" w:hAnsi="Times New Roman" w:eastAsia="Times New Roman"/>
                 <w:sz w:val="21"/>
               </w:rPr>
-              <w:t>Диалоги, непрочитанные, история и нормализация номера</w:t>
+              <w:t>Ошибки соединения, диалоги, история, номера и pairing import</w:t>
+            </w:r>
+          </w:p>
+        </w:tc>
+        <w:tc>
+          <w:tcPr>
+            <w:tcW w:type="dxa" w:w="2778"/>
+            <w:tcMar>
+              <w:top w:w="70" w:type="dxa"/>
+              <w:start w:w="90" w:type="dxa"/>
+              <w:bottom w:w="70" w:type="dxa"/>
+              <w:end w:w="90" w:type="dxa"/>
+            </w:tcMar>
+            <w:vAlign w:val="center"/>
+            <w:shd w:fill="FAFBFC"/>
+          </w:tcPr>
+          <w:p>
+            <w:pPr>
+              <w:spacing w:line="240" w:lineRule="auto" w:after="0"/>
+              <w:ind w:firstLine="0"/>
+              <w:jc w:val="left"/>
+            </w:pPr>
+            <w:r>
+              <w:rPr>
+                <w:rFonts w:ascii="Times New Roman" w:hAnsi="Times New Roman" w:eastAsia="Times New Roman"/>
+                <w:sz w:val="21"/>
+              </w:rPr>
+              <w:t>7 тестов пройдены</w:t>
+            </w:r>
+          </w:p>
+        </w:tc>
+      </w:tr>
+      <w:tr>
+        <w:trPr>
+          <w:cantSplit/>
+        </w:trPr>
+        <w:tc>
+          <w:tcPr>
+            <w:tcW w:type="dxa" w:w="1928"/>
+            <w:tcMar>
+              <w:top w:w="70" w:type="dxa"/>
+              <w:start w:w="90" w:type="dxa"/>
+              <w:bottom w:w="70" w:type="dxa"/>
+              <w:end w:w="90" w:type="dxa"/>
+            </w:tcMar>
+            <w:vAlign w:val="center"/>
+          </w:tcPr>
+          <w:p>
+            <w:pPr>
+              <w:spacing w:line="240" w:lineRule="auto" w:after="0"/>
+              <w:ind w:firstLine="0"/>
+              <w:jc w:val="left"/>
+            </w:pPr>
+            <w:r>
+              <w:rPr>
+                <w:rFonts w:ascii="Times New Roman" w:hAnsi="Times New Roman" w:eastAsia="Times New Roman"/>
+                <w:sz w:val="21"/>
+              </w:rPr>
+              <w:t>Guided setup и pairing</w:t>
+            </w:r>
+          </w:p>
+        </w:tc>
+        <w:tc>
+          <w:tcPr>
+            <w:tcW w:type="dxa" w:w="4082"/>
+            <w:tcMar>
+              <w:top w:w="70" w:type="dxa"/>
+              <w:start w:w="90" w:type="dxa"/>
+              <w:bottom w:w="70" w:type="dxa"/>
+              <w:end w:w="90" w:type="dxa"/>
+            </w:tcMar>
+            <w:vAlign w:val="center"/>
+          </w:tcPr>
+          <w:p>
+            <w:pPr>
+              <w:spacing w:line="240" w:lineRule="auto" w:after="0"/>
+              <w:ind w:firstLine="0"/>
+              <w:jc w:val="left"/>
+            </w:pPr>
+            <w:r>
+              <w:rPr>
+                <w:rFonts w:ascii="Times New Roman" w:hAnsi="Times New Roman" w:eastAsia="Times New Roman"/>
+                <w:sz w:val="21"/>
+              </w:rPr>
+              <w:t>Автовыбор, ambiguity, refusal, private export и no-overwrite</w:t>
+            </w:r>
+          </w:p>
+        </w:tc>
+        <w:tc>
+          <w:tcPr>
+            <w:tcW w:type="dxa" w:w="2778"/>
+            <w:tcMar>
+              <w:top w:w="70" w:type="dxa"/>
+              <w:start w:w="90" w:type="dxa"/>
+              <w:bottom w:w="70" w:type="dxa"/>
+              <w:end w:w="90" w:type="dxa"/>
+            </w:tcMar>
+            <w:vAlign w:val="center"/>
+          </w:tcPr>
+          <w:p>
+            <w:pPr>
+              <w:spacing w:line="240" w:lineRule="auto" w:after="0"/>
+              <w:ind w:firstLine="0"/>
+              <w:jc w:val="left"/>
+            </w:pPr>
+            <w:r>
+              <w:rPr>
+                <w:rFonts w:ascii="Times New Roman" w:hAnsi="Times New Roman" w:eastAsia="Times New Roman"/>
+                <w:sz w:val="21"/>
+              </w:rPr>
+              <w:t>5 тестов пройдены</w:t>
+            </w:r>
+          </w:p>
+        </w:tc>
+      </w:tr>
+      <w:tr>
+        <w:trPr>
+          <w:cantSplit/>
+        </w:trPr>
+        <w:tc>
+          <w:tcPr>
+            <w:tcW w:type="dxa" w:w="1928"/>
+            <w:tcMar>
+              <w:top w:w="70" w:type="dxa"/>
+              <w:start w:w="90" w:type="dxa"/>
+              <w:bottom w:w="70" w:type="dxa"/>
+              <w:end w:w="90" w:type="dxa"/>
+            </w:tcMar>
+            <w:vAlign w:val="center"/>
+            <w:shd w:fill="FAFBFC"/>
+          </w:tcPr>
+          <w:p>
+            <w:pPr>
+              <w:spacing w:line="240" w:lineRule="auto" w:after="0"/>
+              <w:ind w:firstLine="0"/>
+              <w:jc w:val="center"/>
+            </w:pPr>
+            <w:r>
+              <w:rPr>
+                <w:rFonts w:ascii="Times New Roman" w:hAnsi="Times New Roman" w:eastAsia="Times New Roman"/>
+                <w:sz w:val="21"/>
+              </w:rPr>
+              <w:t>Hardware profiles</w:t>
+            </w:r>
+          </w:p>
+        </w:tc>
+        <w:tc>
+          <w:tcPr>
+            <w:tcW w:type="dxa" w:w="4082"/>
+            <w:tcMar>
+              <w:top w:w="70" w:type="dxa"/>
+              <w:start w:w="90" w:type="dxa"/>
+              <w:bottom w:w="70" w:type="dxa"/>
+              <w:end w:w="90" w:type="dxa"/>
+            </w:tcMar>
+            <w:vAlign w:val="center"/>
+            <w:shd w:fill="FAFBFC"/>
+          </w:tcPr>
+          <w:p>
+            <w:pPr>
+              <w:spacing w:line="240" w:lineRule="auto" w:after="0"/>
+              <w:ind w:firstLine="0"/>
+              <w:jc w:val="left"/>
+            </w:pPr>
+            <w:r>
+              <w:rPr>
+                <w:rFonts w:ascii="Times New Roman" w:hAnsi="Times New Roman" w:eastAsia="Times New Roman"/>
+                <w:sz w:val="21"/>
+              </w:rPr>
+              <w:t>Точное совпадение и отказ near-match</w:t>
             </w:r>
           </w:p>
         </w:tc>
@@ -13647,7 +13865,7 @@
                 <w:rFonts w:ascii="Times New Roman" w:hAnsi="Times New Roman" w:eastAsia="Times New Roman"/>
                 <w:sz w:val="21"/>
               </w:rPr>
-              <w:t>Hardware profiles</w:t>
+              <w:t>SMS durability</w:t>
             </w:r>
           </w:p>
         </w:tc>
@@ -13673,7 +13891,7 @@
                 <w:rFonts w:ascii="Times New Roman" w:hAnsi="Times New Roman" w:eastAsia="Times New Roman"/>
                 <w:sz w:val="21"/>
               </w:rPr>
-              <w:t>Точное совпадение и отказ near-match</w:t>
+              <w:t>Границы polling, rotation и чтение архива</w:t>
             </w:r>
           </w:p>
         </w:tc>
@@ -13731,7 +13949,7 @@
                 <w:rFonts w:ascii="Times New Roman" w:hAnsi="Times New Roman" w:eastAsia="Times New Roman"/>
                 <w:sz w:val="21"/>
               </w:rPr>
-              <w:t>SMS durability</w:t>
+              <w:t>Voice protocol</w:t>
             </w:r>
           </w:p>
         </w:tc>
@@ -13758,7 +13976,7 @@
                 <w:rFonts w:ascii="Times New Roman" w:hAnsi="Times New Roman" w:eastAsia="Times New Roman"/>
                 <w:sz w:val="21"/>
               </w:rPr>
-              <w:t>Границы polling, rotation и чтение архива</w:t>
+              <w:t>Challenge-response, payload, адрес и отказ plaintext</w:t>
             </w:r>
           </w:p>
         </w:tc>
@@ -13785,7 +14003,7 @@
                 <w:rFonts w:ascii="Times New Roman" w:hAnsi="Times New Roman" w:eastAsia="Times New Roman"/>
                 <w:sz w:val="21"/>
               </w:rPr>
-              <w:t>2 теста пройдены</w:t>
+              <w:t>4 теста пройдены</w:t>
             </w:r>
           </w:p>
         </w:tc>
@@ -13816,7 +14034,7 @@
                 <w:rFonts w:ascii="Times New Roman" w:hAnsi="Times New Roman" w:eastAsia="Times New Roman"/>
                 <w:sz w:val="21"/>
               </w:rPr>
-              <w:t>Voice protocol</w:t>
+              <w:t>Итого unittest</w:t>
             </w:r>
           </w:p>
         </w:tc>
@@ -13842,7 +14060,7 @@
                 <w:rFonts w:ascii="Times New Roman" w:hAnsi="Times New Roman" w:eastAsia="Times New Roman"/>
                 <w:sz w:val="21"/>
               </w:rPr>
-              <w:t>Challenge-response, payload, адрес и отказ plaintext</w:t>
+              <w:t>uv + pyusb 1.3.1</w:t>
             </w:r>
           </w:p>
         </w:tc>
@@ -13868,7 +14086,7 @@
                 <w:rFonts w:ascii="Times New Roman" w:hAnsi="Times New Roman" w:eastAsia="Times New Roman"/>
                 <w:sz w:val="21"/>
               </w:rPr>
-              <w:t>3 теста пройдены</w:t>
+              <w:t>23 из 23 пройдены за 1,522 с</w:t>
             </w:r>
           </w:p>
         </w:tc>
@@ -13900,7 +14118,7 @@
                 <w:rFonts w:ascii="Times New Roman" w:hAnsi="Times New Roman" w:eastAsia="Times New Roman"/>
                 <w:sz w:val="21"/>
               </w:rPr>
-              <w:t>Итого unittest</w:t>
+              <w:t>Project guard</w:t>
             </w:r>
           </w:p>
         </w:tc>
@@ -13927,7 +14145,7 @@
                 <w:rFonts w:ascii="Times New Roman" w:hAnsi="Times New Roman" w:eastAsia="Times New Roman"/>
                 <w:sz w:val="21"/>
               </w:rPr>
-              <w:t>uv + pyusb 1.3.1</w:t>
+              <w:t>Версии, секреты, размеры и pins GitHub Actions</w:t>
             </w:r>
           </w:p>
         </w:tc>
@@ -13954,89 +14172,6 @@
                 <w:rFonts w:ascii="Times New Roman" w:hAnsi="Times New Roman" w:eastAsia="Times New Roman"/>
                 <w:sz w:val="21"/>
               </w:rPr>
-              <w:t>12 из 12 пройдены за 1,022 с</w:t>
-            </w:r>
-          </w:p>
-        </w:tc>
-      </w:tr>
-      <w:tr>
-        <w:trPr>
-          <w:cantSplit/>
-        </w:trPr>
-        <w:tc>
-          <w:tcPr>
-            <w:tcW w:type="dxa" w:w="1928"/>
-            <w:tcMar>
-              <w:top w:w="70" w:type="dxa"/>
-              <w:start w:w="90" w:type="dxa"/>
-              <w:bottom w:w="70" w:type="dxa"/>
-              <w:end w:w="90" w:type="dxa"/>
-            </w:tcMar>
-            <w:vAlign w:val="center"/>
-          </w:tcPr>
-          <w:p>
-            <w:pPr>
-              <w:spacing w:line="240" w:lineRule="auto" w:after="0"/>
-              <w:ind w:firstLine="0"/>
-              <w:jc w:val="center"/>
-            </w:pPr>
-            <w:r>
-              <w:rPr>
-                <w:rFonts w:ascii="Times New Roman" w:hAnsi="Times New Roman" w:eastAsia="Times New Roman"/>
-                <w:sz w:val="21"/>
-              </w:rPr>
-              <w:t>Project guard</w:t>
-            </w:r>
-          </w:p>
-        </w:tc>
-        <w:tc>
-          <w:tcPr>
-            <w:tcW w:type="dxa" w:w="4082"/>
-            <w:tcMar>
-              <w:top w:w="70" w:type="dxa"/>
-              <w:start w:w="90" w:type="dxa"/>
-              <w:bottom w:w="70" w:type="dxa"/>
-              <w:end w:w="90" w:type="dxa"/>
-            </w:tcMar>
-            <w:vAlign w:val="center"/>
-          </w:tcPr>
-          <w:p>
-            <w:pPr>
-              <w:spacing w:line="240" w:lineRule="auto" w:after="0"/>
-              <w:ind w:firstLine="0"/>
-              <w:jc w:val="left"/>
-            </w:pPr>
-            <w:r>
-              <w:rPr>
-                <w:rFonts w:ascii="Times New Roman" w:hAnsi="Times New Roman" w:eastAsia="Times New Roman"/>
-                <w:sz w:val="21"/>
-              </w:rPr>
-              <w:t>Версии, секреты, размеры и pins GitHub Actions</w:t>
-            </w:r>
-          </w:p>
-        </w:tc>
-        <w:tc>
-          <w:tcPr>
-            <w:tcW w:type="dxa" w:w="2778"/>
-            <w:tcMar>
-              <w:top w:w="70" w:type="dxa"/>
-              <w:start w:w="90" w:type="dxa"/>
-              <w:bottom w:w="70" w:type="dxa"/>
-              <w:end w:w="90" w:type="dxa"/>
-            </w:tcMar>
-            <w:vAlign w:val="center"/>
-          </w:tcPr>
-          <w:p>
-            <w:pPr>
-              <w:spacing w:line="240" w:lineRule="auto" w:after="0"/>
-              <w:ind w:firstLine="0"/>
-              <w:jc w:val="left"/>
-            </w:pPr>
-            <w:r>
-              <w:rPr>
-                <w:rFonts w:ascii="Times New Roman" w:hAnsi="Times New Roman" w:eastAsia="Times New Roman"/>
-                <w:sz w:val="21"/>
-              </w:rPr>
               <w:t>Пройдено для версии 0.5.0</w:t>
             </w:r>
           </w:p>
@@ -14060,7 +14195,7 @@
           <w:rFonts w:ascii="Times New Roman" w:hAnsi="Times New Roman" w:eastAsia="Times New Roman"/>
           <w:sz w:val="28"/>
         </w:rPr>
-        <w:t>Итог — 12 тестов из 12, время по отчёту unittest 1,022 секунды. Проверка voice protocol запускает fake gateway и подтверждает challenge-response, передачу большого control payload, запрет DNS/немодемного адреса и отказ от несовместимого plaintext gateway. Hardware profile tests подтверждают exact match и отрицательные сценарии. SMS tests проверяют не только happy path, но и границы интервалов и rotation archive.</w:t>
+        <w:t>Итог — 23 теста из 23, время по отчёту unittest 1,522 секунды. Проверка voice protocol запускает fake gateway и подтверждает challenge-response, передачу большого control payload, запрет DNS/немодемного адреса и отказ от несовместимого plaintext gateway. Семь desktop model tests охватывают connection errors, диалоги, историю, нормализацию номера, импорт .ufi-phone, отказ неизвестному формату и предел 16 КиБ. Пять guided setup tests подтверждают автовыбор устройств, desktop-only, отказ при ambiguity и unverified hardware, а также приватный no-overwrite export. Hardware profile и SMS tests проверяют exact match, отрицательные сценарии, границы интервалов и rotation archive.</w:t>
       </w:r>
     </w:p>
     <w:p>
@@ -14075,7 +14210,7 @@
           <w:rFonts w:ascii="Times New Roman" w:hAnsi="Times New Roman" w:eastAsia="Times New Roman"/>
           <w:sz w:val="28"/>
         </w:rPr>
-        <w:t>Project guard запущен отдельно и вернул Project guard passed for version 0.5.0. Он сопоставляет version в CHANGELOG, Gradle, standalone build, modem manifest, Windows installer и Linux metadata. Кроме того, сканирует tracked files на шаблоны Telegram/GitHub/Google tokens и private keys, ограничивает размер и требует 40-символьные SHA для GitHub Actions.</w:t>
+        <w:t>Project guard запущен отдельно и вернул Project guard passed for version 0.5.0. Он сопоставляет version в CHANGELOG, Gradle, standalone build, modem manifest, Windows installer и Linux metadata. Кроме того, guard сканирует tracked files на шаблоны Telegram/GitHub/Google tokens и private keys, ограничивает размер и требует 40-символьные SHA для GitHub Actions; отдельный CI step валидирует Gradle wrapper binaries.</w:t>
       </w:r>
     </w:p>
     <w:p>
@@ -14146,7 +14281,7 @@
           <w:rFonts w:ascii="Times New Roman" w:hAnsi="Times New Roman" w:eastAsia="Times New Roman"/>
           <w:sz w:val="28"/>
         </w:rPr>
-        <w:t>Статическая инвентаризация текущего рабочего дерева показала 12 384 строки в Python, Java, XML, shell и Gradle-файлах, без учёта .git и rendered presentation validation. Это число характеризует масштаб прототипа, а не качество само по себе. Более важным является наличие независимых компонентов, отрицательных тестов и документации о границах.</w:t>
+        <w:t>Статическая инвентаризация текущего рабочего дерева показала 13 401 строку в Python, Java, XML, shell и Gradle-файлах, без учёта .git и rendered presentation validation. Это число характеризует масштаб прототипа, а не качество само по себе. Более важным является наличие независимых компонентов, отрицательных тестов и документации о границах.</w:t>
       </w:r>
     </w:p>
     <w:p>
@@ -14176,7 +14311,7 @@
           <w:rFonts w:ascii="Times New Roman" w:hAnsi="Times New Roman" w:eastAsia="Times New Roman"/>
           <w:sz w:val="28"/>
         </w:rPr>
-        <w:t>Ограничения тестирования следует фиксировать. Unit tests не измеряют акустическое качество, энергопотребление за 24 часа, поведение каждого тарифа или редкие modem crashes. Store artifacts и installers требуют отдельного smoke на чистых системах. Platform certificate check зависит от корректности локального key directory. Поэтому перед production-использованием проводится пилот с named hardware/firmware, SIM и журналом результатов.</w:t>
+        <w:t>Ограничения тестирования следует фиксировать. Unit tests не измеряют акустическое качество, энергопотребление за 24 часа, поведение каждого тарифа или редкие modem crashes. Store artifacts, installers и native .ufi-phone handlers требуют отдельного smoke на чистых системах. Platform certificate check зависит от корректности локального key directory. Поэтому перед production-использованием проводится пилот с named hardware/firmware, SIM и журналом результатов.</w:t>
       </w:r>
     </w:p>
     <w:p>
@@ -14203,7 +14338,7 @@
           <w:rFonts w:ascii="Times New Roman" w:hAnsi="Times New Roman" w:eastAsia="Times New Roman"/>
           <w:sz w:val="28"/>
         </w:rPr>
-        <w:t>Основное ограничение — hardware specificity. UFI Phone нельзя устанавливать на устройство только из-за надписи UFI003. Второе — отсутствие IMS/VoLTE: работоспособность голоса зависит от сохранения 2G/3G fallback в сети оператора. Третье — один аудиоклиент. Четвёртое — emergency/service calls блокируются. Пятое — tablet/desktop history локальна и не синхронизируется через облачный аккаунт.</w:t>
+        <w:t>Основное ограничение — hardware specificity. UFI Phone нельзя устанавливать на устройство только из-за надписи UFI003. Второе — отсутствие IMS/VoLTE: работоспособность голоса зависит от сохранения 2G/3G fallback в сети оператора. Третье — один аудиоклиент. Четвёртое — emergency/service calls блокируются. Пятое — tablet/desktop history локальна и не синхронизируется через облачный аккаунт. Шестое — .ufi-phone переносит действующий access key в открытом JSON, поэтому удобство дополнительного desktop требует доверенного канала передачи и удаления файла.</w:t>
       </w:r>
     </w:p>
     <w:p>
@@ -15006,7 +15141,7 @@
           <w:rFonts w:ascii="Times New Roman" w:hAnsi="Times New Roman" w:eastAsia="Times New Roman"/>
           <w:sz w:val="28"/>
         </w:rPr>
-        <w:t>Экономический эффект оценивается качественно. Комплекс использует имеющийся модем, SIM и экран, сокращая потребность в отдельном смартфоне и developer relay. Основные затраты связаны не с облачным трафиком, а с установкой, проверкой совместимости и поддержкой аппаратного профиля. Для серийного продукта бизнес-модель должна учитывать тестирование каждой партии firmware и операторские изменения; низкая цена hardware не отменяет стоимость quality assurance.</w:t>
+        <w:t>Экономический эффект оценивается качественно: комплекс использует имеющиеся модем, SIM и экран вместо отдельного смартфона и developer relay. Основные затраты связаны с установкой, совместимостью и поддержкой аппаратных профилей; серийный продукт требует тестировать партии firmware и операторские изменения.</w:t>
       </w:r>
     </w:p>
     <w:p>
@@ -15021,7 +15156,7 @@
           <w:rFonts w:ascii="Times New Roman" w:hAnsi="Times New Roman" w:eastAsia="Times New Roman"/>
           <w:sz w:val="28"/>
         </w:rPr>
-        <w:t>Вывод по третьей главе: реализован сквозной путь от безопасного doctor и profile-gated install до звонков, аудио, SMS и клиентских пакетов. Все 12 автоматических тестов и project guard проходят в воспроизводимой среде. Реальные результаты ограничены UFI003/Ucell и честно отделены от планируемой проверки других операторов. Комплекс готов к контролируемому пилоту, но не к заявлению универсальной совместимости.</w:t>
+        <w:t>Вывод по третьей главе: реализован путь от безопасной профильной установки до звонков, аудио, SMS и клиентских пакетов. Все 23 теста и project guard проходят. Результаты подтверждены для UFI003/Ucell; другие операторы требуют проверки, поэтому комплекс готов к контролируемому пилоту, но не к заявлению универсальной совместимости.</w:t>
       </w:r>
     </w:p>
     <w:p>
@@ -15032,6 +15167,7 @@
     <w:p>
       <w:pPr>
         <w:pStyle w:val="Heading1"/>
+        <w:pageBreakBefore w:val="0"/>
       </w:pPr>
       <w:r>
         <w:rPr>
@@ -15838,7 +15974,7 @@
           <w:rFonts w:ascii="Times New Roman" w:hAnsi="Times New Roman" w:eastAsia="Times New Roman"/>
           <w:sz w:val="28"/>
         </w:rPr>
-        <w:t>Отдельная группа риска связана с данными. SMS могут содержать коды подтверждения, номера и личную переписку; аудиоканал — частный разговор. Демонстрация должна использовать синтетические данные. Screen recording, bug report и console log проверяются перед публикацией. Pairing token и platform private key не пересылаются в чат и не помещаются в дипломные иллюстрации.</w:t>
+        <w:t>Отдельная группа риска связана с данными. SMS могут содержать коды подтверждения, номера и личную переписку; аудиоканал — частный разговор. Демонстрация должна использовать синтетические данные. Screen recording, bug report и console log проверяются перед публикацией. Pairing token и platform private key не пересылаются в чат и не помещаются в дипломные иллюстрации. Файл .ufi-phone нельзя отправлять обычной почтой, публиковать или хранить в общей папке: он содержит тот же access key.</w:t>
       </w:r>
     </w:p>
     <w:p>
@@ -16161,7 +16297,7 @@
           <w:rFonts w:ascii="Times New Roman" w:hAnsi="Times New Roman" w:eastAsia="Times New Roman"/>
           <w:sz w:val="28"/>
         </w:rPr>
-        <w:t>Минимизация данных реализуется технически: doctor не собирает IMSI/IMEI и SMS; gateway bind ограничен; logs не должны содержать token и content; history хранится локально и ограничена по числу записей; analytics отсутствует. Pairing выполняется при физическом ADB-доступе. При передаче устройства другому владельцу конфигурация и история удаляются, token регенерируется, а Telegram credential при наличии отзывается.</w:t>
+        <w:t>Минимизация данных реализуется технически: doctor не собирает IMSI/IMEI и SMS; gateway bind ограничен; logs не должны содержать token и content; history хранится локально и ограничена по числу записей; analytics отсутствует. Первичный pairing выполняется при физическом ADB-доступе. Явно экспортированный .ufi-phone передаётся доверенным способом, удаляется после импорта, а при возможном раскрытии token регенерируется. При передаче устройства другому владельцу конфигурация и история удаляются, token заменяется, а Telegram credential при наличии отзывается.</w:t>
       </w:r>
     </w:p>
     <w:p>
@@ -16217,6 +16353,7 @@
     <w:p>
       <w:pPr>
         <w:pStyle w:val="Heading1"/>
+        <w:pageBreakBefore w:val="0"/>
       </w:pPr>
       <w:r>
         <w:rPr>
@@ -16283,7 +16420,7 @@
           <w:rFonts w:ascii="Times New Roman" w:hAnsi="Times New Roman" w:eastAsia="Times New Roman"/>
           <w:sz w:val="28"/>
         </w:rPr>
-        <w:t>Разработана безопасная установка. ufi_setup.py doctor собирает только redacted whitelist, сопоставляет product, SDK, baseband, USB ID, LAN и capabilities с hardware-profiles.json. Privileged install разрешается только для tested exact match и совпадающего platform certificate. Внешне похожий или неполный профиль отклоняется.</w:t>
+        <w:t>Разработана безопасная установка. ufi_setup.py doctor собирает только redacted whitelist, сопоставляет product, SDK, baseband, USB ID, LAN и capabilities с hardware-profiles.json. Рекомендуемый ./setup.sh автоматически выбирает один tested-модем и один совместимый планшет, показывает план, собирает, устанавливает, выполняет pairing и проверяет gateway. --dry-run не меняет устройства, а неоднозначный или неполный профиль отклоняется до privileged install.</w:t>
       </w:r>
     </w:p>
     <w:p>
@@ -16298,7 +16435,7 @@
           <w:rFonts w:ascii="Times New Roman" w:hAnsi="Times New Roman" w:eastAsia="Times New Roman"/>
           <w:sz w:val="28"/>
         </w:rPr>
-        <w:t>Локальный протокол связывает каждый control или audio сеанс с новым 32-байтным nonce и HMAC-SHA-256 proof. В вычисление входят domain, port, nonce и конкретная команда/stream. Сервер слушает только 192.168.100.1, принимает клиентов из частной /24, ограничивает число sessions и допускает один uplink/downlink. Pairing token длиной 256 бит создаётся локально и передаётся через защищённый ADB receiver.</w:t>
+        <w:t>Локальный протокол связывает каждый control или audio сеанс с новым 32-байтным nonce и HMAC-SHA-256 proof. В вычисление входят domain, port, nonce и конкретная команда/stream. Сервер слушает только 192.168.100.1, принимает клиентов из частной /24, ограничивает число sessions и допускает один uplink/downlink. Pairing token длиной 256 бит создаётся локально и первично передаётся через защищённый ADB receiver. Для дополнительного desktop его можно явно экспортировать в .ufi-phone; импорт ограничен 16 КиБ и проверяет kind, version, host и token.</w:t>
       </w:r>
     </w:p>
     <w:p>
@@ -16313,7 +16450,7 @@
           <w:rFonts w:ascii="Times New Roman" w:hAnsi="Times New Roman" w:eastAsia="Times New Roman"/>
           <w:sz w:val="28"/>
         </w:rPr>
-        <w:t>Реализованы входящие и исходящие вызовы, Answer, Hang up, двусторонний PCM audio, полноэкранное уведомление, локальная история, синхронизация до 250 SMS, диалоги, read state и отправка сообщений. Android foreground service восстанавливается после reboot. Desktop client работает в Linux и Windows, а отдельные CLI сохраняют диагностику и fallback.</w:t>
+        <w:t>Реализованы входящие и исходящие вызовы, Answer, Hang up, двусторонний PCM audio, полноэкранное уведомление, локальная история, синхронизация до 250 SMS, диалоги, read state и отправка сообщений. Android foreground service восстанавливается после reboot и показывает actionable setup/offline cards. Desktop client работает в Linux и Windows, открывает guided Connection на чистой установке и поддерживает native .ufi-phone import; отдельные CLI сохраняют диагностику и fallback.</w:t>
       </w:r>
     </w:p>
     <w:p>
@@ -16328,7 +16465,7 @@
           <w:rFonts w:ascii="Times New Roman" w:hAnsi="Times New Roman" w:eastAsia="Times New Roman"/>
           <w:sz w:val="28"/>
         </w:rPr>
-        <w:t>Фактическая проверка 25 сентября 2026 года выполнена в изолированной среде с PyUSB 1.3.1. Все 12 тестов прошли за 1,022 секунды. Проверены manifests, desktop model, negative hardware matches, SMS durability и challenge-response voice protocol. Project guard подтвердил согласованность версии 0.5.0, контроль secret patterns, размеров и commit pinning GitHub Actions.</w:t>
+        <w:t>Фактическая проверка 27 сентября 2026 года выполнена в изолированной среде с PyUSB 1.3.1. Все 23 теста прошли за 1,522 секунды. Проверены manifests, desktop model и pairing import, guided setup и private export, negative hardware matches, SMS durability и challenge-response voice protocol. Project guard подтвердил согласованность версии 0.5.0, контроль secret patterns, размеров и commit pinning GitHub Actions.</w:t>
       </w:r>
     </w:p>
     <w:p>
@@ -16358,17 +16495,13 @@
           <w:rFonts w:ascii="Times New Roman" w:hAnsi="Times New Roman" w:eastAsia="Times New Roman"/>
           <w:sz w:val="28"/>
         </w:rPr>
-        <w:t>Поставленная цель достигнута на уровне работающего и технически обоснованного прототипа версии 0.5.0. Следующими этапами являются operator validation, длительные reconnect/battery tests, closed testing Android companion, выпуск подписанных пакетов из одного tag и портирование второго модема без ослабления exact-match policy. Разработанная архитектура создаёт основу для недорогого приватного communication gateway и показывает, как аппаратно-зависимую телефонию можно отделить от развиваемого multi-platform интерфейса.</w:t>
+        <w:t>Цель достигнута на уровне работающего прототипа 0.5.0. Далее требуются проверка операторов, длительные reconnect/battery tests, closed testing Android, единый подписанный release и второй exact-match профиль. Архитектура отделяет аппаратную телефонию от multi-platform интерфейса.</w:t>
       </w:r>
     </w:p>
     <w:p>
-      <w:r>
-        <w:br w:type="page"/>
-      </w:r>
-    </w:p>
-    <w:p>
       <w:pPr>
         <w:pStyle w:val="Heading1"/>
+        <w:pageBreakBefore/>
       </w:pPr>
       <w:r>
         <w:rPr>
@@ -17484,7 +17617,7 @@
           <w:rFonts w:ascii="Times New Roman" w:hAnsi="Times New Roman" w:eastAsia="Times New Roman"/>
           <w:sz w:val="24"/>
         </w:rPr>
-        <w:t>31. UFI Phone. README и описание возможностей проекта. Локальная документация репозитория, версия 0.5.0, 2026.</w:t>
+        <w:t>31. UFI Phone. README, setup guide и описание переносимого pairing. Локальная документация репозитория, версия 0.5.0, 2026.</w:t>
       </w:r>
     </w:p>
     <w:p>

</xml_diff>